<commit_message>
Dev handover: Black Friday pre-sale box, welcome-kit count and Flow
Co-Authored-By: Claude Opus 5.5 <noreply@anthropic.com>
Claude-Session: https://claude.ai/code/session_01YUaqMprd9jDWbjH8Lh4n9H
</commit_message>
<xml_diff>
--- a/handoff/MUTO_Dev_Handoff_PDP_BuyBox_17Oct2026.docx
+++ b/handoff/MUTO_Dev_Handoff_PDP_BuyBox_17Oct2026.docx
@@ -182,10 +182,7 @@
         <w:t xml:space="preserve">template changes on 2 products</w:t>
       </w:r>
       <w:r>
-        <w:t xml:space="preserve"> </w:t>
-      </w:r>
-      <w:r>
-        <w:t xml:space="preserve">and</w:t>
+        <w:t xml:space="preserve">,</w:t>
       </w:r>
       <w:r>
         <w:t xml:space="preserve"> </w:t>
@@ -198,7 +195,26 @@
         <w:t xml:space="preserve">photos on 1 product</w:t>
       </w:r>
       <w:r>
-        <w:t xml:space="preserve">.</w:t>
+        <w:t xml:space="preserve"> </w:t>
+      </w:r>
+      <w:r>
+        <w:t xml:space="preserve">and a</w:t>
+      </w:r>
+      <w:r>
+        <w:t xml:space="preserve"> </w:t>
+      </w:r>
+      <w:r>
+        <w:rPr>
+          <w:bCs/>
+          <w:b/>
+        </w:rPr>
+        <w:t xml:space="preserve">Shopify Flow</w:t>
+      </w:r>
+      <w:r>
+        <w:t xml:space="preserve"> </w:t>
+      </w:r>
+      <w:r>
+        <w:t xml:space="preserve">for the Black Friday pre-sale box.</w:t>
       </w:r>
     </w:p>
     <w:bookmarkStart w:id="22" w:name="before-you-start"/>
@@ -1936,13 +1952,34 @@
     </w:p>
     <w:bookmarkEnd w:id="26"/>
     <w:bookmarkEnd w:id="27"/>
-    <w:bookmarkStart w:id="28" w:name="notes"/>
+    <w:bookmarkStart w:id="31" w:name="black-friday-pre-sale-box-both-templates"/>
     <w:p>
       <w:pPr>
         <w:pStyle w:val="Heading1"/>
       </w:pPr>
       <w:r>
-        <w:t xml:space="preserve">Notes</w:t>
+        <w:t xml:space="preserve">Black Friday pre-sale box (both templates)</w:t>
+      </w:r>
+    </w:p>
+    <w:p>
+      <w:pPr>
+        <w:pStyle w:val="FirstParagraph"/>
+      </w:pPr>
+      <w:r>
+        <w:t xml:space="preserve">A dark box sits above the plan boxes. It runs from page load until</w:t>
+      </w:r>
+      <w:r>
+        <w:t xml:space="preserve"> </w:t>
+      </w:r>
+      <w:r>
+        <w:rPr>
+          <w:bCs/>
+          <w:b/>
+        </w:rPr>
+        <w:t xml:space="preserve">23:59 UK time on Wednesday 28 October</w:t>
+      </w:r>
+      <w:r>
+        <w:t xml:space="preserve">, then hides itself.</w:t>
       </w:r>
     </w:p>
     <w:p>
@@ -1954,74 +1991,125 @@
         <w:pStyle w:val="Compact"/>
       </w:pPr>
       <w:r>
-        <w:t xml:space="preserve">☐</w:t>
-      </w:r>
-      <w:r>
-        <w:t xml:space="preserve"> </w:t>
-      </w:r>
-      <w:r>
-        <w:rPr>
-          <w:bCs/>
-          <w:b/>
-        </w:rPr>
-        <w:t xml:space="preserve">Product titles in cart and checkout:</w:t>
-      </w:r>
-      <w:r>
-        <w:t xml:space="preserve"> </w:t>
-      </w:r>
-      <w:r>
-        <w:t xml:space="preserve">-2 and -3 are titled</w:t>
-      </w:r>
-      <w:r>
-        <w:t xml:space="preserve"> </w:t>
-      </w:r>
+        <w:rPr>
+          <w:bCs/>
+          <w:b/>
+        </w:rPr>
+        <w:t xml:space="preserve">What it shows:</w:t>
+      </w:r>
+    </w:p>
+    <w:p>
+      <w:pPr>
+        <w:numPr>
+          <w:ilvl w:val="1"/>
+          <w:numId w:val="1012"/>
+        </w:numPr>
+        <w:pStyle w:val="Compact"/>
+      </w:pPr>
       <w:r>
         <w:t xml:space="preserve">“</w:t>
       </w:r>
       <w:r>
-        <w:t xml:space="preserve">NAD+ Cellular Complex 2</w:t>
+        <w:t xml:space="preserve">BLACK FRIDAY PRE-SALE</w:t>
       </w:r>
       <w:r>
         <w:t xml:space="preserve">”</w:t>
       </w:r>
       <w:r>
-        <w:t xml:space="preserve"> </w:t>
-      </w:r>
-      <w:r>
-        <w:t xml:space="preserve">and</w:t>
-      </w:r>
-      <w:r>
-        <w:t xml:space="preserve"> </w:t>
-      </w:r>
+        <w:t xml:space="preserve">.</w:t>
+      </w:r>
+    </w:p>
+    <w:p>
+      <w:pPr>
+        <w:numPr>
+          <w:ilvl w:val="1"/>
+          <w:numId w:val="1012"/>
+        </w:numPr>
+        <w:pStyle w:val="Compact"/>
+      </w:pPr>
       <w:r>
         <w:t xml:space="preserve">“</w:t>
       </w:r>
       <w:r>
-        <w:t xml:space="preserve">NAD+ Cellular Complex 3</w:t>
+        <w:t xml:space="preserve">Extra 10% off the Quarterly plan, plus a free welcome kit worth £77</w:t>
       </w:r>
       <w:r>
         <w:t xml:space="preserve">”</w:t>
       </w:r>
       <w:r>
-        <w:t xml:space="preserve">, and that title shows in the cart and order emails. Rename both to</w:t>
-      </w:r>
-      <w:r>
-        <w:t xml:space="preserve"> </w:t>
-      </w:r>
+        <w:t xml:space="preserve">.</w:t>
+      </w:r>
+    </w:p>
+    <w:p>
+      <w:pPr>
+        <w:numPr>
+          <w:ilvl w:val="1"/>
+          <w:numId w:val="1012"/>
+        </w:numPr>
+        <w:pStyle w:val="Compact"/>
+      </w:pPr>
       <w:r>
         <w:t xml:space="preserve">“</w:t>
       </w:r>
       <w:r>
-        <w:t xml:space="preserve">NAD+ Cellular Complex</w:t>
+        <w:t xml:space="preserve">£135 for your first box instead of £150. Code MUTO10 is applied automatically at checkout</w:t>
       </w:r>
       <w:r>
         <w:t xml:space="preserve">”</w:t>
       </w:r>
       <w:r>
-        <w:t xml:space="preserve"> </w:t>
-      </w:r>
-      <w:r>
-        <w:t xml:space="preserve">if they get traffic.</w:t>
+        <w:t xml:space="preserve">.</w:t>
+      </w:r>
+    </w:p>
+    <w:p>
+      <w:pPr>
+        <w:numPr>
+          <w:ilvl w:val="1"/>
+          <w:numId w:val="1012"/>
+        </w:numPr>
+        <w:pStyle w:val="Compact"/>
+      </w:pPr>
+      <w:r>
+        <w:t xml:space="preserve">A live countdown in days, hours, minutes and seconds.</w:t>
+      </w:r>
+    </w:p>
+    <w:p>
+      <w:pPr>
+        <w:numPr>
+          <w:ilvl w:val="1"/>
+          <w:numId w:val="1012"/>
+        </w:numPr>
+        <w:pStyle w:val="Compact"/>
+      </w:pPr>
+      <w:r>
+        <w:t xml:space="preserve">“</w:t>
+      </w:r>
+      <w:r>
+        <w:t xml:space="preserve">Pre-sale ends 23:59, Wednesday 28 October.</w:t>
+      </w:r>
+      <w:r>
+        <w:t xml:space="preserve">”</w:t>
+      </w:r>
+    </w:p>
+    <w:p>
+      <w:pPr>
+        <w:numPr>
+          <w:ilvl w:val="1"/>
+          <w:numId w:val="1012"/>
+        </w:numPr>
+        <w:pStyle w:val="Compact"/>
+      </w:pPr>
+      <w:r>
+        <w:t xml:space="preserve">“</w:t>
+      </w:r>
+      <w:r>
+        <w:t xml:space="preserve">92 of 500 free welcome kits left at this price</w:t>
+      </w:r>
+      <w:r>
+        <w:t xml:space="preserve">”</w:t>
+      </w:r>
+      <w:r>
+        <w:t xml:space="preserve">, with a progress bar.</w:t>
       </w:r>
     </w:p>
     <w:p>
@@ -2033,23 +2121,71 @@
         <w:pStyle w:val="Compact"/>
       </w:pPr>
       <w:r>
-        <w:t xml:space="preserve">☐</w:t>
-      </w:r>
-      <w:r>
-        <w:t xml:space="preserve"> </w:t>
-      </w:r>
-      <w:r>
-        <w:rPr>
-          <w:bCs/>
-          <w:b/>
-        </w:rPr>
-        <w:t xml:space="preserve">-3 is Unlisted.</w:t>
-      </w:r>
-      <w:r>
-        <w:t xml:space="preserve"> </w:t>
-      </w:r>
-      <w:r>
-        <w:t xml:space="preserve">It works by direct link but won’t appear in search or collections. That’s fine for ad traffic.</w:t>
+        <w:rPr>
+          <w:bCs/>
+          <w:b/>
+        </w:rPr>
+        <w:t xml:space="preserve">How it’s built:</w:t>
+      </w:r>
+      <w:r>
+        <w:t xml:space="preserve"> </w:t>
+      </w:r>
+      <w:r>
+        <w:t xml:space="preserve">template-only, in the same</w:t>
+      </w:r>
+      <w:r>
+        <w:t xml:space="preserve"> </w:t>
+      </w:r>
+      <w:r>
+        <w:rPr>
+          <w:rStyle w:val="VerbatimChar"/>
+        </w:rPr>
+        <w:t xml:space="preserve">easy_read</w:t>
+      </w:r>
+      <w:r>
+        <w:t xml:space="preserve"> </w:t>
+      </w:r>
+      <w:r>
+        <w:t xml:space="preserve">block. The source is</w:t>
+      </w:r>
+      <w:r>
+        <w:t xml:space="preserve"> </w:t>
+      </w:r>
+      <w:r>
+        <w:rPr>
+          <w:rStyle w:val="VerbatimChar"/>
+        </w:rPr>
+        <w:t xml:space="preserve">shopify/pdp-45/artah/bf.js</w:t>
+      </w:r>
+      <w:r>
+        <w:t xml:space="preserve"> </w:t>
+      </w:r>
+      <w:r>
+        <w:t xml:space="preserve">and</w:t>
+      </w:r>
+      <w:r>
+        <w:t xml:space="preserve"> </w:t>
+      </w:r>
+      <w:r>
+        <w:rPr>
+          <w:rStyle w:val="VerbatimChar"/>
+        </w:rPr>
+        <w:t xml:space="preserve">bf.css</w:t>
+      </w:r>
+      <w:r>
+        <w:t xml:space="preserve">. The end date, the code and the total of 500 are set at the top of</w:t>
+      </w:r>
+      <w:r>
+        <w:t xml:space="preserve"> </w:t>
+      </w:r>
+      <w:r>
+        <w:rPr>
+          <w:rStyle w:val="VerbatimChar"/>
+        </w:rPr>
+        <w:t xml:space="preserve">bf.js</w:t>
+      </w:r>
+      <w:r>
+        <w:t xml:space="preserve">.</w:t>
       </w:r>
     </w:p>
     <w:p>
@@ -2065,6 +2201,548 @@
           <w:bCs/>
           <w:b/>
         </w:rPr>
+        <w:t xml:space="preserve">The code:</w:t>
+      </w:r>
+      <w:r>
+        <w:t xml:space="preserve"> </w:t>
+      </w:r>
+      <w:r>
+        <w:t xml:space="preserve">the page calls</w:t>
+      </w:r>
+      <w:r>
+        <w:t xml:space="preserve"> </w:t>
+      </w:r>
+      <w:r>
+        <w:rPr>
+          <w:rStyle w:val="VerbatimChar"/>
+        </w:rPr>
+        <w:t xml:space="preserve">/discount/MUTO10</w:t>
+      </w:r>
+      <w:r>
+        <w:t xml:space="preserve"> </w:t>
+      </w:r>
+      <w:r>
+        <w:t xml:space="preserve">when it loads, so Shopify applies the code at checkout. MUTO10 already exists: 10% off, applies to subscriptions and one-time purchases, once per customer. It works on both plans, even though the box only promotes the Quarterly plan.</w:t>
+      </w:r>
+    </w:p>
+    <w:bookmarkStart w:id="28" w:name="welcome-kits-left"/>
+    <w:p>
+      <w:pPr>
+        <w:pStyle w:val="Heading2"/>
+      </w:pPr>
+      <w:r>
+        <w:t xml:space="preserve">Welcome kits left</w:t>
+      </w:r>
+    </w:p>
+    <w:p>
+      <w:pPr>
+        <w:pStyle w:val="FirstParagraph"/>
+      </w:pPr>
+      <w:r>
+        <w:t xml:space="preserve">The number comes from a shop metafield,</w:t>
+      </w:r>
+      <w:r>
+        <w:t xml:space="preserve"> </w:t>
+      </w:r>
+      <w:r>
+        <w:rPr>
+          <w:rStyle w:val="VerbatimChar"/>
+        </w:rPr>
+        <w:t xml:space="preserve">muto.bf_boxes_left</w:t>
+      </w:r>
+      <w:r>
+        <w:t xml:space="preserve">. It’s set to</w:t>
+      </w:r>
+      <w:r>
+        <w:t xml:space="preserve"> </w:t>
+      </w:r>
+      <w:r>
+        <w:rPr>
+          <w:bCs/>
+          <w:b/>
+        </w:rPr>
+        <w:t xml:space="preserve">92</w:t>
+      </w:r>
+      <w:r>
+        <w:t xml:space="preserve">, the real pre-Black Friday allocation. To edit it: Settings → Custom data → Shop →</w:t>
+      </w:r>
+      <w:r>
+        <w:t xml:space="preserve"> </w:t>
+      </w:r>
+      <w:r>
+        <w:t xml:space="preserve">“</w:t>
+      </w:r>
+      <w:r>
+        <w:t xml:space="preserve">Black Friday welcome kits left</w:t>
+      </w:r>
+      <w:r>
+        <w:t xml:space="preserve">”</w:t>
+      </w:r>
+      <w:r>
+        <w:t xml:space="preserve">. If it’s blank, the line is hidden.</w:t>
+      </w:r>
+    </w:p>
+    <w:bookmarkEnd w:id="28"/>
+    <w:bookmarkStart w:id="29" w:name="Xd66add57f70860710e44db38993d8499a7ddeb2"/>
+    <w:p>
+      <w:pPr>
+        <w:pStyle w:val="Heading2"/>
+      </w:pPr>
+      <w:r>
+        <w:t xml:space="preserve">Set up: Shopify Flow to lower the count by 1 per new customer</w:t>
+      </w:r>
+    </w:p>
+    <w:p>
+      <w:pPr>
+        <w:numPr>
+          <w:ilvl w:val="0"/>
+          <w:numId w:val="1013"/>
+        </w:numPr>
+        <w:pStyle w:val="Compact"/>
+      </w:pPr>
+      <w:r>
+        <w:t xml:space="preserve">Flow → Create workflow → Trigger:</w:t>
+      </w:r>
+      <w:r>
+        <w:t xml:space="preserve"> </w:t>
+      </w:r>
+      <w:r>
+        <w:rPr>
+          <w:bCs/>
+          <w:b/>
+        </w:rPr>
+        <w:t xml:space="preserve">Order created</w:t>
+      </w:r>
+      <w:r>
+        <w:t xml:space="preserve">.</w:t>
+      </w:r>
+    </w:p>
+    <w:p>
+      <w:pPr>
+        <w:numPr>
+          <w:ilvl w:val="0"/>
+          <w:numId w:val="1013"/>
+        </w:numPr>
+        <w:pStyle w:val="Compact"/>
+      </w:pPr>
+      <w:r>
+        <w:t xml:space="preserve">Condition, all of:</w:t>
+      </w:r>
+    </w:p>
+    <w:p>
+      <w:pPr>
+        <w:numPr>
+          <w:ilvl w:val="1"/>
+          <w:numId w:val="1014"/>
+        </w:numPr>
+        <w:pStyle w:val="Compact"/>
+      </w:pPr>
+      <w:r>
+        <w:t xml:space="preserve">the customer’s number of orders is equal to 1 (welcome kits only go out with first orders, so Skio renewals don’t count);</w:t>
+      </w:r>
+    </w:p>
+    <w:p>
+      <w:pPr>
+        <w:numPr>
+          <w:ilvl w:val="1"/>
+          <w:numId w:val="1014"/>
+        </w:numPr>
+        <w:pStyle w:val="Compact"/>
+      </w:pPr>
+      <w:r>
+        <w:rPr>
+          <w:rStyle w:val="VerbatimChar"/>
+        </w:rPr>
+        <w:t xml:space="preserve">muto.bf_boxes_left</w:t>
+      </w:r>
+      <w:r>
+        <w:t xml:space="preserve"> </w:t>
+      </w:r>
+      <w:r>
+        <w:t xml:space="preserve">is greater than 0.</w:t>
+      </w:r>
+    </w:p>
+    <w:p>
+      <w:pPr>
+        <w:numPr>
+          <w:ilvl w:val="0"/>
+          <w:numId w:val="1013"/>
+        </w:numPr>
+        <w:pStyle w:val="Compact"/>
+      </w:pPr>
+      <w:r>
+        <w:t xml:space="preserve">Action:</w:t>
+      </w:r>
+      <w:r>
+        <w:t xml:space="preserve"> </w:t>
+      </w:r>
+      <w:r>
+        <w:rPr>
+          <w:bCs/>
+          <w:b/>
+        </w:rPr>
+        <w:t xml:space="preserve">Update shop metafield</w:t>
+      </w:r>
+      <w:r>
+        <w:t xml:space="preserve">:</w:t>
+      </w:r>
+    </w:p>
+    <w:p>
+      <w:pPr>
+        <w:numPr>
+          <w:ilvl w:val="1"/>
+          <w:numId w:val="1015"/>
+        </w:numPr>
+        <w:pStyle w:val="Compact"/>
+      </w:pPr>
+      <w:r>
+        <w:t xml:space="preserve">namespace</w:t>
+      </w:r>
+      <w:r>
+        <w:t xml:space="preserve"> </w:t>
+      </w:r>
+      <w:r>
+        <w:rPr>
+          <w:rStyle w:val="VerbatimChar"/>
+        </w:rPr>
+        <w:t xml:space="preserve">muto</w:t>
+      </w:r>
+      <w:r>
+        <w:t xml:space="preserve">, key</w:t>
+      </w:r>
+      <w:r>
+        <w:t xml:space="preserve"> </w:t>
+      </w:r>
+      <w:r>
+        <w:rPr>
+          <w:rStyle w:val="VerbatimChar"/>
+        </w:rPr>
+        <w:t xml:space="preserve">bf_boxes_left</w:t>
+      </w:r>
+      <w:r>
+        <w:t xml:space="preserve">, type Integer;</w:t>
+      </w:r>
+    </w:p>
+    <w:p>
+      <w:pPr>
+        <w:numPr>
+          <w:ilvl w:val="1"/>
+          <w:numId w:val="1015"/>
+        </w:numPr>
+        <w:pStyle w:val="Compact"/>
+      </w:pPr>
+      <w:r>
+        <w:t xml:space="preserve">value = the current value minus 1, e.g. </w:t>
+      </w:r>
+      <w:r>
+        <w:rPr>
+          <w:rStyle w:val="VerbatimChar"/>
+        </w:rPr>
+        <w:t xml:space="preserve">{{ … bf_boxes_left.value | minus: 1 }}</w:t>
+      </w:r>
+      <w:r>
+        <w:t xml:space="preserve"> </w:t>
+      </w:r>
+      <w:r>
+        <w:t xml:space="preserve">using Flow’s variable picker for the shop metafield.</w:t>
+      </w:r>
+    </w:p>
+    <w:p>
+      <w:pPr>
+        <w:numPr>
+          <w:ilvl w:val="0"/>
+          <w:numId w:val="1013"/>
+        </w:numPr>
+        <w:pStyle w:val="Compact"/>
+      </w:pPr>
+      <w:r>
+        <w:t xml:space="preserve">Turn it on before the box goes live.</w:t>
+      </w:r>
+    </w:p>
+    <w:bookmarkEnd w:id="29"/>
+    <w:bookmarkStart w:id="30" w:name="before-launch"/>
+    <w:p>
+      <w:pPr>
+        <w:pStyle w:val="Heading2"/>
+      </w:pPr>
+      <w:r>
+        <w:t xml:space="preserve">Before launch</w:t>
+      </w:r>
+    </w:p>
+    <w:p>
+      <w:pPr>
+        <w:numPr>
+          <w:ilvl w:val="0"/>
+          <w:numId w:val="1016"/>
+        </w:numPr>
+        <w:pStyle w:val="Compact"/>
+      </w:pPr>
+      <w:r>
+        <w:t xml:space="preserve">☐ In Discounts, give</w:t>
+      </w:r>
+      <w:r>
+        <w:t xml:space="preserve"> </w:t>
+      </w:r>
+      <w:r>
+        <w:rPr>
+          <w:bCs/>
+          <w:b/>
+        </w:rPr>
+        <w:t xml:space="preserve">MUTO10 an end date</w:t>
+      </w:r>
+      <w:r>
+        <w:t xml:space="preserve"> </w:t>
+      </w:r>
+      <w:r>
+        <w:t xml:space="preserve">of 28 Oct 2026, 23:59. Today it has none.</w:t>
+      </w:r>
+    </w:p>
+    <w:p>
+      <w:pPr>
+        <w:numPr>
+          <w:ilvl w:val="0"/>
+          <w:numId w:val="1016"/>
+        </w:numPr>
+        <w:pStyle w:val="Compact"/>
+      </w:pPr>
+      <w:r>
+        <w:t xml:space="preserve">☐</w:t>
+      </w:r>
+      <w:r>
+        <w:t xml:space="preserve"> </w:t>
+      </w:r>
+      <w:r>
+        <w:rPr>
+          <w:bCs/>
+          <w:b/>
+        </w:rPr>
+        <w:t xml:space="preserve">Test orders</w:t>
+      </w:r>
+      <w:r>
+        <w:t xml:space="preserve"> </w:t>
+      </w:r>
+      <w:r>
+        <w:t xml:space="preserve">on the Quarterly plan, the Monthly plan and one-time purchase. Check MUTO10 applies</w:t>
+      </w:r>
+      <w:r>
+        <w:t xml:space="preserve"> </w:t>
+      </w:r>
+      <w:r>
+        <w:rPr>
+          <w:bCs/>
+          <w:b/>
+        </w:rPr>
+        <w:t xml:space="preserve">and</w:t>
+      </w:r>
+      <w:r>
+        <w:t xml:space="preserve"> </w:t>
+      </w:r>
+      <w:r>
+        <w:t xml:space="preserve">the welcome-kit gifts still arrive. MUTO10 doesn’t combine with product discounts, so if the gifts use a product discount, one will cancel the other.</w:t>
+      </w:r>
+    </w:p>
+    <w:p>
+      <w:pPr>
+        <w:numPr>
+          <w:ilvl w:val="0"/>
+          <w:numId w:val="1016"/>
+        </w:numPr>
+        <w:pStyle w:val="Compact"/>
+      </w:pPr>
+      <w:r>
+        <w:t xml:space="preserve">☐</w:t>
+      </w:r>
+      <w:r>
+        <w:t xml:space="preserve"> </w:t>
+      </w:r>
+      <w:r>
+        <w:rPr>
+          <w:bCs/>
+          <w:b/>
+        </w:rPr>
+        <w:t xml:space="preserve">Check the Flow:</w:t>
+      </w:r>
+      <w:r>
+        <w:t xml:space="preserve"> </w:t>
+      </w:r>
+      <w:r>
+        <w:t xml:space="preserve">after one test order, the count drops from 92 to 91.</w:t>
+      </w:r>
+    </w:p>
+    <w:p>
+      <w:pPr>
+        <w:numPr>
+          <w:ilvl w:val="0"/>
+          <w:numId w:val="1016"/>
+        </w:numPr>
+        <w:pStyle w:val="Compact"/>
+      </w:pPr>
+      <w:r>
+        <w:t xml:space="preserve">☐</w:t>
+      </w:r>
+      <w:r>
+        <w:t xml:space="preserve"> </w:t>
+      </w:r>
+      <w:r>
+        <w:rPr>
+          <w:bCs/>
+          <w:b/>
+        </w:rPr>
+        <w:t xml:space="preserve">When the count reaches 0:</w:t>
+      </w:r>
+      <w:r>
+        <w:t xml:space="preserve"> </w:t>
+      </w:r>
+      <w:r>
+        <w:t xml:space="preserve">the free kit or the price must change, because the box says</w:t>
+      </w:r>
+      <w:r>
+        <w:t xml:space="preserve"> </w:t>
+      </w:r>
+      <w:r>
+        <w:t xml:space="preserve">“</w:t>
+      </w:r>
+      <w:r>
+        <w:t xml:space="preserve">at this price</w:t>
+      </w:r>
+      <w:r>
+        <w:t xml:space="preserve">”</w:t>
+      </w:r>
+      <w:r>
+        <w:t xml:space="preserve">. Tell Richie so the box can be updated.</w:t>
+      </w:r>
+    </w:p>
+    <w:bookmarkEnd w:id="30"/>
+    <w:bookmarkEnd w:id="31"/>
+    <w:bookmarkStart w:id="32" w:name="notes"/>
+    <w:p>
+      <w:pPr>
+        <w:pStyle w:val="Heading1"/>
+      </w:pPr>
+      <w:r>
+        <w:t xml:space="preserve">Notes</w:t>
+      </w:r>
+    </w:p>
+    <w:p>
+      <w:pPr>
+        <w:numPr>
+          <w:ilvl w:val="0"/>
+          <w:numId w:val="1017"/>
+        </w:numPr>
+        <w:pStyle w:val="Compact"/>
+      </w:pPr>
+      <w:r>
+        <w:t xml:space="preserve">☐</w:t>
+      </w:r>
+      <w:r>
+        <w:t xml:space="preserve"> </w:t>
+      </w:r>
+      <w:r>
+        <w:rPr>
+          <w:bCs/>
+          <w:b/>
+        </w:rPr>
+        <w:t xml:space="preserve">Product titles in cart and checkout:</w:t>
+      </w:r>
+      <w:r>
+        <w:t xml:space="preserve"> </w:t>
+      </w:r>
+      <w:r>
+        <w:t xml:space="preserve">-2 and -3 are titled</w:t>
+      </w:r>
+      <w:r>
+        <w:t xml:space="preserve"> </w:t>
+      </w:r>
+      <w:r>
+        <w:t xml:space="preserve">“</w:t>
+      </w:r>
+      <w:r>
+        <w:t xml:space="preserve">NAD+ Cellular Complex 2</w:t>
+      </w:r>
+      <w:r>
+        <w:t xml:space="preserve">”</w:t>
+      </w:r>
+      <w:r>
+        <w:t xml:space="preserve"> </w:t>
+      </w:r>
+      <w:r>
+        <w:t xml:space="preserve">and</w:t>
+      </w:r>
+      <w:r>
+        <w:t xml:space="preserve"> </w:t>
+      </w:r>
+      <w:r>
+        <w:t xml:space="preserve">“</w:t>
+      </w:r>
+      <w:r>
+        <w:t xml:space="preserve">NAD+ Cellular Complex 3</w:t>
+      </w:r>
+      <w:r>
+        <w:t xml:space="preserve">”</w:t>
+      </w:r>
+      <w:r>
+        <w:t xml:space="preserve">, and that title shows in the cart and order emails. Rename both to</w:t>
+      </w:r>
+      <w:r>
+        <w:t xml:space="preserve"> </w:t>
+      </w:r>
+      <w:r>
+        <w:t xml:space="preserve">“</w:t>
+      </w:r>
+      <w:r>
+        <w:t xml:space="preserve">NAD+ Cellular Complex</w:t>
+      </w:r>
+      <w:r>
+        <w:t xml:space="preserve">”</w:t>
+      </w:r>
+      <w:r>
+        <w:t xml:space="preserve"> </w:t>
+      </w:r>
+      <w:r>
+        <w:t xml:space="preserve">if they get traffic.</w:t>
+      </w:r>
+    </w:p>
+    <w:p>
+      <w:pPr>
+        <w:numPr>
+          <w:ilvl w:val="0"/>
+          <w:numId w:val="1017"/>
+        </w:numPr>
+        <w:pStyle w:val="Compact"/>
+      </w:pPr>
+      <w:r>
+        <w:t xml:space="preserve">☐</w:t>
+      </w:r>
+      <w:r>
+        <w:t xml:space="preserve"> </w:t>
+      </w:r>
+      <w:r>
+        <w:rPr>
+          <w:bCs/>
+          <w:b/>
+        </w:rPr>
+        <w:t xml:space="preserve">-3 is Unlisted.</w:t>
+      </w:r>
+      <w:r>
+        <w:t xml:space="preserve"> </w:t>
+      </w:r>
+      <w:r>
+        <w:t xml:space="preserve">It works by direct link but won’t appear in search or collections. That’s fine for ad traffic.</w:t>
+      </w:r>
+    </w:p>
+    <w:p>
+      <w:pPr>
+        <w:numPr>
+          <w:ilvl w:val="0"/>
+          <w:numId w:val="1017"/>
+        </w:numPr>
+        <w:pStyle w:val="Compact"/>
+      </w:pPr>
+      <w:r>
+        <w:rPr>
+          <w:bCs/>
+          <w:b/>
+        </w:rPr>
         <w:t xml:space="preserve">Landing pages:</w:t>
       </w:r>
       <w:r>
@@ -2074,8 +2752,8 @@
         <w:t xml:space="preserve">MP1, MP2, MP3 and MP5 link to -2, and the others link to the main URL. After the switch, both URLs show the same design.</w:t>
       </w:r>
     </w:p>
-    <w:bookmarkEnd w:id="28"/>
-    <w:bookmarkStart w:id="29" w:name="check-after-publishing"/>
+    <w:bookmarkEnd w:id="32"/>
+    <w:bookmarkStart w:id="33" w:name="check-after-publishing"/>
     <w:p>
       <w:pPr>
         <w:pStyle w:val="Heading1"/>
@@ -2088,7 +2766,7 @@
       <w:pPr>
         <w:numPr>
           <w:ilvl w:val="0"/>
-          <w:numId w:val="1012"/>
+          <w:numId w:val="1018"/>
         </w:numPr>
         <w:pStyle w:val="Compact"/>
       </w:pPr>
@@ -2104,7 +2782,7 @@
       <w:pPr>
         <w:numPr>
           <w:ilvl w:val="1"/>
-          <w:numId w:val="1013"/>
+          <w:numId w:val="1019"/>
         </w:numPr>
         <w:pStyle w:val="Compact"/>
       </w:pPr>
@@ -2134,7 +2812,7 @@
       <w:pPr>
         <w:numPr>
           <w:ilvl w:val="1"/>
-          <w:numId w:val="1013"/>
+          <w:numId w:val="1019"/>
         </w:numPr>
         <w:pStyle w:val="Compact"/>
       </w:pPr>
@@ -2191,7 +2869,7 @@
       <w:pPr>
         <w:numPr>
           <w:ilvl w:val="0"/>
-          <w:numId w:val="1012"/>
+          <w:numId w:val="1018"/>
         </w:numPr>
         <w:pStyle w:val="Compact"/>
       </w:pPr>
@@ -2243,7 +2921,7 @@
       <w:pPr>
         <w:numPr>
           <w:ilvl w:val="0"/>
-          <w:numId w:val="1012"/>
+          <w:numId w:val="1018"/>
         </w:numPr>
         <w:pStyle w:val="Compact"/>
       </w:pPr>
@@ -2265,7 +2943,7 @@
       <w:pPr>
         <w:numPr>
           <w:ilvl w:val="0"/>
-          <w:numId w:val="1012"/>
+          <w:numId w:val="1018"/>
         </w:numPr>
         <w:pStyle w:val="Compact"/>
       </w:pPr>
@@ -2305,7 +2983,7 @@
       <w:pPr>
         <w:numPr>
           <w:ilvl w:val="0"/>
-          <w:numId w:val="1012"/>
+          <w:numId w:val="1018"/>
         </w:numPr>
         <w:pStyle w:val="Compact"/>
       </w:pPr>
@@ -2327,7 +3005,7 @@
       <w:pPr>
         <w:numPr>
           <w:ilvl w:val="0"/>
-          <w:numId w:val="1012"/>
+          <w:numId w:val="1018"/>
         </w:numPr>
         <w:pStyle w:val="Compact"/>
       </w:pPr>
@@ -2349,7 +3027,7 @@
       <w:pPr>
         <w:numPr>
           <w:ilvl w:val="0"/>
-          <w:numId w:val="1012"/>
+          <w:numId w:val="1018"/>
         </w:numPr>
         <w:pStyle w:val="Compact"/>
       </w:pPr>
@@ -2367,7 +3045,7 @@
         <w:t xml:space="preserve">the plan boxes, gift tiles and button all fit the width.</w:t>
       </w:r>
     </w:p>
-    <w:bookmarkEnd w:id="29"/>
+    <w:bookmarkEnd w:id="33"/>
     <w:sectPr/>
   </w:body>
 </w:document>
@@ -2699,6 +3377,9 @@
     <w:abstractNumId w:val="991"/>
   </w:num>
   <w:num w:numId="1012">
+    <w:abstractNumId w:val="991"/>
+  </w:num>
+  <w:num w:numId="1013">
     <w:abstractNumId w:val="99411"/>
     <w:lvlOverride w:ilvl="0">
       <w:startOverride w:val="1"/>
@@ -2728,7 +3409,49 @@
       <w:startOverride w:val="1"/>
     </w:lvlOverride>
   </w:num>
-  <w:num w:numId="1013">
+  <w:num w:numId="1014">
+    <w:abstractNumId w:val="991"/>
+  </w:num>
+  <w:num w:numId="1015">
+    <w:abstractNumId w:val="991"/>
+  </w:num>
+  <w:num w:numId="1016">
+    <w:abstractNumId w:val="991"/>
+  </w:num>
+  <w:num w:numId="1017">
+    <w:abstractNumId w:val="991"/>
+  </w:num>
+  <w:num w:numId="1018">
+    <w:abstractNumId w:val="99411"/>
+    <w:lvlOverride w:ilvl="0">
+      <w:startOverride w:val="1"/>
+    </w:lvlOverride>
+    <w:lvlOverride w:ilvl="1">
+      <w:startOverride w:val="1"/>
+    </w:lvlOverride>
+    <w:lvlOverride w:ilvl="2">
+      <w:startOverride w:val="1"/>
+    </w:lvlOverride>
+    <w:lvlOverride w:ilvl="3">
+      <w:startOverride w:val="1"/>
+    </w:lvlOverride>
+    <w:lvlOverride w:ilvl="4">
+      <w:startOverride w:val="1"/>
+    </w:lvlOverride>
+    <w:lvlOverride w:ilvl="5">
+      <w:startOverride w:val="1"/>
+    </w:lvlOverride>
+    <w:lvlOverride w:ilvl="6">
+      <w:startOverride w:val="1"/>
+    </w:lvlOverride>
+    <w:lvlOverride w:ilvl="7">
+      <w:startOverride w:val="1"/>
+    </w:lvlOverride>
+    <w:lvlOverride w:ilvl="8">
+      <w:startOverride w:val="1"/>
+    </w:lvlOverride>
+  </w:num>
+  <w:num w:numId="1019">
     <w:abstractNumId w:val="991"/>
   </w:num>
 </w:numbering>

</xml_diff>